<commit_message>
feat: transition ML architecture to Google Colab offline training and backend inference
LiveReview Pre-Commit Check: skipped (iter:1, coverage:0%)
</commit_message>
<xml_diff>
--- a/docs/AI_Retail_Platform_System_Design.docx
+++ b/docs/AI_Retail_Platform_System_Design.docx
@@ -26104,7 +26104,7 @@
           <w:sz w:val="21"/>
           <w:szCs w:val="21"/>
         </w:rPr>
-        <w:t xml:space="preserve">One-directional ML dependency: domains/ imports from ml/; ml/ never imports from domains/. ML code can run standalone from notebooks or training scripts without any FastAPI context.</w:t>
+        <w:t xml:space="preserve">One-directional ML dependency: domains/ imports from ml/; ml/ never imports from domains/. ML code can run standalone as inference routines loading pre-trained models. Training is performed offline in Google Colab.</w:t>
       </w:r>
     </w:p>
     <w:p>
@@ -27079,7 +27079,7 @@
           <w:sz w:val="22"/>
           <w:szCs w:val="22"/>
         </w:rPr>
-        <w:t xml:space="preserve">Separate top-level ml/ directory organised by pipeline domain, each with training/, inference/, and evaluation/ submodules. Domain services import from ml/; ml/ never imports from domains/.</w:t>
+        <w:t xml:space="preserve">Separate top-level ml/ directory organised by pipeline domain, each with inference/ and validation/ submodules. Training is performed offline in Google Colab. Domain services import from ml/; ml/ never imports from domains/.</w:t>
       </w:r>
     </w:p>
     <w:p>
@@ -27435,7 +27435,7 @@
           <w:sz w:val="22"/>
           <w:szCs w:val="22"/>
         </w:rPr>
-        <w:t xml:space="preserve">Note: eligibility_checker.py exists separately in forecasting/training/ and pricing/training/ — they encode different business rules (Section 8.1 vs Section 8.2) and are deliberately not merged.</w:t>
+        <w:t xml:space="preserve">Note: eligibility_checker.py exists separately in forecasting/inference/ and pricing/inference/ — they encode different business rules (Section 8.1 vs Section 8.2) and are deliberately not merged.</w:t>
       </w:r>
     </w:p>
     <w:p>
@@ -28626,7 +28626,7 @@
           <w:sz w:val="21"/>
           <w:szCs w:val="21"/>
         </w:rPr>
-        <w:t xml:space="preserve">Stage 1 Anomaly Detection (PRE_FORECAST_HISTORICAL) → fit Isolation Forest → flag anomalies → upsert anomaly_current</w:t>
+        <w:t xml:space="preserve">Stage 1 Anomaly Detection (PRE_FORECAST_HISTORICAL) → load Isolation Forest → flag anomalies → upsert anomaly_current</w:t>
       </w:r>
     </w:p>
     <w:p>
@@ -28645,7 +28645,7 @@
           <w:sz w:val="21"/>
           <w:szCs w:val="21"/>
         </w:rPr>
-        <w:t xml:space="preserve">Forecasting → eligibility check → fit and infer → upsert forecast_current + insert forecast_history</w:t>
+        <w:t xml:space="preserve">Forecasting → eligibility check → load models &amp; infer → upsert forecast_current + insert forecast_history</w:t>
       </w:r>
     </w:p>
     <w:p>
@@ -28664,7 +28664,7 @@
           <w:sz w:val="21"/>
           <w:szCs w:val="21"/>
         </w:rPr>
-        <w:t xml:space="preserve">Pricing → eligibility check (history + price variation) → fit elasticity → generate candidates → optimise → upsert pricing_current + insert pricing_history</w:t>
+        <w:t xml:space="preserve">Pricing → eligibility check (history + price variation) → load elasticity model → generate candidates → optimise → upsert pricing_current + insert pricing_history</w:t>
       </w:r>
     </w:p>
     <w:p>
@@ -29004,7 +29004,7 @@
                 <w:sz w:val="19"/>
                 <w:szCs w:val="19"/>
               </w:rPr>
-              <w:t xml:space="preserve">Prophet fits on (date, quantity_sold) + regressors (promotion, holiday). XGBoost fits on residuals (actual − Prophet predicted). Composer: Prophet predict + XGBoost residual correction. Clip negatives to 0. Both horizon_7d and horizon_30d produced. confidence_label = HIGH.</w:t>
+              <w:t xml:space="preserve">Prophet infers on (date, quantity_sold) + regressors (promotion, holiday). XGBoost infers on residuals (actual − Prophet predicted). Composer: Prophet predict + XGBoost residual correction. Clip negatives to 0. Both horizon_7d and horizon_30d produced. confidence_label = HIGH.</w:t>
             </w:r>
           </w:p>
         </w:tc>
@@ -29357,7 +29357,7 @@
           <w:sz w:val="21"/>
           <w:szCs w:val="21"/>
         </w:rPr>
-        <w:t xml:space="preserve">Stage 1 (pre-forecast): fit IsolationForest(contamination=auto) on processed_sales features [quantity_sold, selling_price, rolling_avg_7d, day_of_week]. Classify: SPIKE / DROP / UNUSUAL. Generate explanation string per flag (FR-21). Zero writes to raw_sales or processed_sales.</w:t>
+        <w:t xml:space="preserve">Stage 1 (pre-forecast): run pre-trained IsolationForest(contamination=auto) on processed_sales features [quantity_sold, selling_price, rolling_avg_7d, day_of_week]. Classify: SPIKE / DROP / UNUSUAL. Generate explanation string per flag (FR-21). Zero writes to raw_sales or processed_sales.</w:t>
       </w:r>
     </w:p>
     <w:p>
@@ -36283,7 +36283,7 @@
                 <w:sz w:val="19"/>
                 <w:szCs w:val="19"/>
               </w:rPr>
-              <w:t xml:space="preserve">Prophet fitting time: O(products) fits, each 5–30 seconds</w:t>
+              <w:t xml:space="preserve">Prophet inference time: O(products) runs, each ~0.5-2 seconds</w:t>
             </w:r>
           </w:p>
         </w:tc>
@@ -36599,7 +36599,7 @@
                 <w:sz w:val="19"/>
                 <w:szCs w:val="19"/>
               </w:rPr>
-              <w:t xml:space="preserve">Prophet fitting dominates: 100 products × 15s = ~25 min per upload</w:t>
+              <w:t xml:space="preserve">Prophet inference dominates: 100 products × 1.5s = ~2.5 min per upload</w:t>
             </w:r>
           </w:p>
         </w:tc>
@@ -38814,7 +38814,7 @@
                 <w:sz w:val="19"/>
                 <w:szCs w:val="19"/>
               </w:rPr>
-              <w:t xml:space="preserve">Separate top-level ml/ directory; per-pipeline submodules (training/, inference/, evaluation/)</w:t>
+              <w:t xml:space="preserve">Separate top-level ml/ directory; per-pipeline submodules (inference/, validation/)</w:t>
             </w:r>
           </w:p>
         </w:tc>

</xml_diff>